<commit_message>
Actualiza reporte practica 14 con capturas de codigo
</commit_message>
<xml_diff>
--- a/output/doc/Reporte_Practica14_FlatList_SectionList.docx
+++ b/output/doc/Reporte_Practica14_FlatList_SectionList.docx
@@ -2,6 +2,7 @@
 <file path=word/document.xml><?xml version="1.0" encoding="utf-8"?>
 <w:document xmlns:wpc="http://schemas.microsoft.com/office/word/2010/wordprocessingCanvas" xmlns:mo="http://schemas.microsoft.com/office/mac/office/2008/main" xmlns:mc="http://schemas.openxmlformats.org/markup-compatibility/2006" xmlns:mv="urn:schemas-microsoft-com:mac:vml" xmlns:o="urn:schemas-microsoft-com:office:office" xmlns:r="http://schemas.openxmlformats.org/officeDocument/2006/relationships" xmlns:m="http://schemas.openxmlformats.org/officeDocument/2006/math" xmlns:v="urn:schemas-microsoft-com:vml" xmlns:wp14="http://schemas.microsoft.com/office/word/2010/wordprocessingDrawing" xmlns:wp="http://schemas.openxmlformats.org/drawingml/2006/wordprocessingDrawing" xmlns:w10="urn:schemas-microsoft-com:office:word" xmlns:w="http://schemas.openxmlformats.org/wordprocessingml/2006/main" xmlns:w14="http://schemas.microsoft.com/office/word/2010/wordml" xmlns:wpg="http://schemas.microsoft.com/office/word/2010/wordprocessingGroup" xmlns:wpi="http://schemas.microsoft.com/office/word/2010/wordprocessingInk" xmlns:wne="http://schemas.microsoft.com/office/word/2006/wordml" xmlns:wps="http://schemas.microsoft.com/office/word/2010/wordprocessingShape" mc:Ignorable="w14 wp14">
   <w:body>
+    <w:p/>
     <w:p/>
     <w:p/>
     <w:p/>
@@ -28,6 +29,7 @@
       </w:pPr>
       <w:r>
         <w:rPr>
+          <w:b w:val="0"/>
           <w:sz w:val="24"/>
         </w:rPr>
         <w:t>Joan Osvaldo Higuera Gallardo</w:t>
@@ -40,6 +42,7 @@
       </w:pPr>
       <w:r>
         <w:rPr>
+          <w:b w:val="0"/>
           <w:sz w:val="24"/>
         </w:rPr>
         <w:t>S201</w:t>
@@ -51,6 +54,7 @@
       </w:pPr>
       <w:r>
         <w:rPr>
+          <w:b w:val="0"/>
           <w:sz w:val="24"/>
         </w:rPr>
         <w:t>29 de Junio del 2026</w:t>
@@ -73,9 +77,6 @@
         <w:jc w:val="center"/>
       </w:pPr>
       <w:r>
-        <w:rPr>
-          <w:sz w:val="24"/>
-        </w:rPr>
         <w:t>Desarrollo de la practica paso a paso.</w:t>
       </w:r>
     </w:p>
@@ -94,68 +95,7 @@
     </w:p>
     <w:p>
       <w:r>
-        <w:t>Practicar y trabajar con los componentes nativos FlatList y SectionList en una aplicacion movil desarrollada con React Native y Expo.</w:t>
-      </w:r>
-    </w:p>
-    <w:p>
-      <w:pPr>
-        <w:pStyle w:val="Heading1"/>
-      </w:pPr>
-      <w:r>
-        <w:t>Material utilizado</w:t>
-      </w:r>
-    </w:p>
-    <w:p>
-      <w:pPr>
-        <w:pStyle w:val="ListBullet"/>
-      </w:pPr>
-      <w:r>
-        <w:t>Visual Studio Code para editar el proyecto.</w:t>
-      </w:r>
-    </w:p>
-    <w:p>
-      <w:pPr>
-        <w:pStyle w:val="ListBullet"/>
-      </w:pPr>
-      <w:r>
-        <w:t>Proyecto base: C:\PROGRAMACION\APLICACIONES MOVILES\practica14\Practica5.</w:t>
-      </w:r>
-    </w:p>
-    <w:p>
-      <w:pPr>
-        <w:pStyle w:val="ListBullet"/>
-      </w:pPr>
-      <w:r>
-        <w:t>Node.js, npm y Expo para ejecutar y exportar la aplicacion.</w:t>
-      </w:r>
-    </w:p>
-    <w:p>
-      <w:pPr>
-        <w:pStyle w:val="ListBullet"/>
-      </w:pPr>
-      <w:r>
-        <w:t>React Native para implementar las pantallas de FlatList y SectionList.</w:t>
-      </w:r>
-    </w:p>
-    <w:p>
-      <w:pPr>
-        <w:pStyle w:val="ListBullet"/>
-      </w:pPr>
-      <w:r>
-        <w:t>Navegador local y Playwright para obtener capturas de evidencia.</w:t>
-      </w:r>
-    </w:p>
-    <w:p>
-      <w:pPr>
-        <w:pStyle w:val="Heading1"/>
-      </w:pPr>
-      <w:r>
-        <w:t>Descripcion de la practica</w:t>
-      </w:r>
-    </w:p>
-    <w:p>
-      <w:r>
-        <w:t>La practica consistio en crear una aplicacion con un menu principal que permite abrir dos pantallas: una construida con FlatList y otra con SectionList. La primera pantalla muestra una lista de estudiantes a partir de un arreglo de datos. La segunda organiza estudiantes por secciones para demostrar el uso de encabezados y elementos agrupados.</w:t>
+        <w:t>Practicar y trabajar con los componentes nativos FlatList y SectionList en React Native, comprobando su funcionamiento mediante una aplicacion movil desarrollada con Expo.</w:t>
       </w:r>
     </w:p>
     <w:p>
@@ -171,7 +111,7 @@
         <w:pStyle w:val="ListNumber"/>
       </w:pPr>
       <w:r>
-        <w:t>Se abrio la carpeta C:\PROGRAMACION\APLICACIONES MOVILES\practica14\Practica5.</w:t>
+        <w:t>Se reviso la indicacion de la Practica No.14 para trabajar con FlatList y SectionList.</w:t>
       </w:r>
     </w:p>
     <w:p>
@@ -179,7 +119,7 @@
         <w:pStyle w:val="ListNumber"/>
       </w:pPr>
       <w:r>
-        <w:t>Se revisaron los archivos existentes de la practica y se comprobo que ya existian las pantallas FlatlistScreen.js y SectionListScreen.js.</w:t>
+        <w:t>Se abrio el proyecto ubicado en C:\PROGRAMACION\APLICACIONES MOVILES\practica14\Practica5.</w:t>
       </w:r>
     </w:p>
     <w:p>
@@ -187,7 +127,7 @@
         <w:pStyle w:val="ListNumber"/>
       </w:pPr>
       <w:r>
-        <w:t>Se actualizo App.js para cargar MenuScreen como pantalla principal de la aplicacion.</w:t>
+        <w:t>Se verifico que App.js cargue MenuScreen como pantalla principal de la aplicacion.</w:t>
       </w:r>
     </w:p>
     <w:p>
@@ -195,7 +135,7 @@
         <w:pStyle w:val="ListNumber"/>
       </w:pPr>
       <w:r>
-        <w:t>Se ajusto MenuScreen.js para mostrar el titulo de la Practica No.14 y botones para abrir FlatList y SectionList.</w:t>
+        <w:t>Se ajusto MenuScreen.js para mostrar un menu con botones hacia FlatList y SectionList.</w:t>
       </w:r>
     </w:p>
     <w:p>
@@ -203,7 +143,7 @@
         <w:pStyle w:val="ListNumber"/>
       </w:pPr>
       <w:r>
-        <w:t>Se agrego un boton Regresar en las pantallas de FlatList y SectionList para volver al menu principal.</w:t>
+        <w:t>Se implemento FlatlistScreen.js usando un arreglo de estudiantes, keyExtractor y renderItem.</w:t>
       </w:r>
     </w:p>
     <w:p>
@@ -211,7 +151,7 @@
         <w:pStyle w:val="ListNumber"/>
       </w:pPr>
       <w:r>
-        <w:t>Se verifico que FlatList renderiza una lista de estudiantes usando data, keyExtractor y renderItem.</w:t>
+        <w:t>Se reutilizo el componente Estudiante para mostrar nombre y carrera dentro de cada tarjeta.</w:t>
       </w:r>
     </w:p>
     <w:p>
@@ -219,7 +159,7 @@
         <w:pStyle w:val="ListNumber"/>
       </w:pPr>
       <w:r>
-        <w:t>Se verifico que SectionList renderiza grupos de estudiantes usando sections, renderSectionHeader y renderItem.</w:t>
+        <w:t>Se implemento SectionListScreen.js usando secciones agrupadas por carrera.</w:t>
       </w:r>
     </w:p>
     <w:p>
@@ -227,7 +167,7 @@
         <w:pStyle w:val="ListNumber"/>
       </w:pPr>
       <w:r>
-        <w:t>Se ejecuto Expo en modo web para comprobar visualmente la aplicacion.</w:t>
+        <w:t>Se agregaron encabezados de seccion y tarjetas para mostrar cada estudiante.</w:t>
       </w:r>
     </w:p>
     <w:p>
@@ -235,7 +175,7 @@
         <w:pStyle w:val="ListNumber"/>
       </w:pPr>
       <w:r>
-        <w:t>Se exporto el proyecto con Expo para confirmar que compila sin errores.</w:t>
+        <w:t>Se ejecuto la aplicacion con Expo en modo web para comprobar el funcionamiento visual.</w:t>
       </w:r>
     </w:p>
     <w:p>
@@ -243,7 +183,7 @@
         <w:pStyle w:val="ListNumber"/>
       </w:pPr>
       <w:r>
-        <w:t>Se tomaron capturas de pantalla del menu, FlatList y SectionList para integrarlas al reporte.</w:t>
+        <w:t>Se tomaron capturas del codigo en Visual Studio Code y capturas de la aplicacion funcionando.</w:t>
       </w:r>
     </w:p>
     <w:p>
@@ -251,468 +191,346 @@
         <w:pStyle w:val="Heading1"/>
       </w:pPr>
       <w:r>
-        <w:t>Codigo principal: App.js</w:t>
+        <w:t>Evidencia de codigo en Visual Studio Code</w:t>
+      </w:r>
+    </w:p>
+    <w:p>
+      <w:r>
+        <w:t>Las siguientes capturas muestran el codigo dentro de Visual Studio Code, siguiendo el formato de evidencia usado en la practica de referencia.</w:t>
+      </w:r>
+    </w:p>
+    <w:p>
+      <w:r>
+        <w:rPr>
+          <w:b/>
+        </w:rPr>
+        <w:t>Captura 1. Archivo App.js como entrada principal de la aplicacion.</w:t>
       </w:r>
     </w:p>
     <w:p>
       <w:pPr>
-        <w:shd w:fill="F2F2F2"/>
+        <w:jc w:val="center"/>
       </w:pPr>
       <w:r>
+        <w:drawing>
+          <wp:inline xmlns:a="http://schemas.openxmlformats.org/drawingml/2006/main" xmlns:pic="http://schemas.openxmlformats.org/drawingml/2006/picture">
+            <wp:extent cx="5852160" cy="3784979"/>
+            <wp:docPr id="1" name="Picture 1"/>
+            <wp:cNvGraphicFramePr>
+              <a:graphicFrameLocks noChangeAspect="1"/>
+            </wp:cNvGraphicFramePr>
+            <a:graphic>
+              <a:graphicData uri="http://schemas.openxmlformats.org/drawingml/2006/picture">
+                <pic:pic>
+                  <pic:nvPicPr>
+                    <pic:cNvPr id="0" name="01_app_js_vscode.png"/>
+                    <pic:cNvPicPr/>
+                  </pic:nvPicPr>
+                  <pic:blipFill>
+                    <a:blip r:embed="rId9"/>
+                    <a:stretch>
+                      <a:fillRect/>
+                    </a:stretch>
+                  </pic:blipFill>
+                  <pic:spPr>
+                    <a:xfrm>
+                      <a:off x="0" y="0"/>
+                      <a:ext cx="5852160" cy="3784979"/>
+                    </a:xfrm>
+                    <a:prstGeom prst="rect"/>
+                  </pic:spPr>
+                </pic:pic>
+              </a:graphicData>
+            </a:graphic>
+          </wp:inline>
+        </w:drawing>
+      </w:r>
+    </w:p>
+    <w:p>
+      <w:r>
         <w:rPr>
-          <w:rFonts w:ascii="Courier New" w:hAnsi="Courier New"/>
-          <w:sz w:val="16"/>
+          <w:b/>
         </w:rPr>
-        <w:t>import { StatusBar } from 'expo-status-bar';</w:t>
-        <w:br/>
-        <w:t>import MenuScreen from './Screens/MenuScreen';</w:t>
-        <w:br/>
-        <w:br/>
-        <w:t>export default function App() {</w:t>
-        <w:br/>
-        <w:t xml:space="preserve">  return (</w:t>
-        <w:br/>
-        <w:t xml:space="preserve">    &lt;&gt;</w:t>
-        <w:br/>
-        <w:t xml:space="preserve">      &lt;MenuScreen /&gt;</w:t>
-        <w:br/>
-        <w:t xml:space="preserve">      &lt;StatusBar style="auto" /&gt;</w:t>
-        <w:br/>
-        <w:t xml:space="preserve">    &lt;/&gt;</w:t>
-        <w:br/>
-        <w:t xml:space="preserve">  );</w:t>
-        <w:br/>
-        <w:t>}</w:t>
-        <w:br/>
+        <w:t>Captura 2. MenuScreen.js con navegacion hacia FlatList y SectionList.</w:t>
       </w:r>
     </w:p>
     <w:p>
       <w:pPr>
-        <w:pStyle w:val="Heading1"/>
+        <w:jc w:val="center"/>
       </w:pPr>
       <w:r>
-        <w:t>Codigo del menu: Screens/MenuScreen.js</w:t>
+        <w:drawing>
+          <wp:inline xmlns:a="http://schemas.openxmlformats.org/drawingml/2006/main" xmlns:pic="http://schemas.openxmlformats.org/drawingml/2006/picture">
+            <wp:extent cx="5852160" cy="3784979"/>
+            <wp:docPr id="2" name="Picture 2"/>
+            <wp:cNvGraphicFramePr>
+              <a:graphicFrameLocks noChangeAspect="1"/>
+            </wp:cNvGraphicFramePr>
+            <a:graphic>
+              <a:graphicData uri="http://schemas.openxmlformats.org/drawingml/2006/picture">
+                <pic:pic>
+                  <pic:nvPicPr>
+                    <pic:cNvPr id="0" name="02_menu_inicio_vscode.png"/>
+                    <pic:cNvPicPr/>
+                  </pic:nvPicPr>
+                  <pic:blipFill>
+                    <a:blip r:embed="rId10"/>
+                    <a:stretch>
+                      <a:fillRect/>
+                    </a:stretch>
+                  </pic:blipFill>
+                  <pic:spPr>
+                    <a:xfrm>
+                      <a:off x="0" y="0"/>
+                      <a:ext cx="5852160" cy="3784979"/>
+                    </a:xfrm>
+                    <a:prstGeom prst="rect"/>
+                  </pic:spPr>
+                </pic:pic>
+              </a:graphicData>
+            </a:graphic>
+          </wp:inline>
+        </w:drawing>
+      </w:r>
+    </w:p>
+    <w:p>
+      <w:r>
+        <w:rPr>
+          <w:b/>
+        </w:rPr>
+        <w:t>Captura 3. MenuScreen.js con botones principales y estilos de pantalla.</w:t>
       </w:r>
     </w:p>
     <w:p>
       <w:pPr>
-        <w:shd w:fill="F2F2F2"/>
+        <w:jc w:val="center"/>
       </w:pPr>
       <w:r>
+        <w:drawing>
+          <wp:inline xmlns:a="http://schemas.openxmlformats.org/drawingml/2006/main" xmlns:pic="http://schemas.openxmlformats.org/drawingml/2006/picture">
+            <wp:extent cx="5852160" cy="3784979"/>
+            <wp:docPr id="3" name="Picture 3"/>
+            <wp:cNvGraphicFramePr>
+              <a:graphicFrameLocks noChangeAspect="1"/>
+            </wp:cNvGraphicFramePr>
+            <a:graphic>
+              <a:graphicData uri="http://schemas.openxmlformats.org/drawingml/2006/picture">
+                <pic:pic>
+                  <pic:nvPicPr>
+                    <pic:cNvPr id="0" name="03_menu_final_vscode.png"/>
+                    <pic:cNvPicPr/>
+                  </pic:nvPicPr>
+                  <pic:blipFill>
+                    <a:blip r:embed="rId11"/>
+                    <a:stretch>
+                      <a:fillRect/>
+                    </a:stretch>
+                  </pic:blipFill>
+                  <pic:spPr>
+                    <a:xfrm>
+                      <a:off x="0" y="0"/>
+                      <a:ext cx="5852160" cy="3784979"/>
+                    </a:xfrm>
+                    <a:prstGeom prst="rect"/>
+                  </pic:spPr>
+                </pic:pic>
+              </a:graphicData>
+            </a:graphic>
+          </wp:inline>
+        </w:drawing>
+      </w:r>
+    </w:p>
+    <w:p>
+      <w:r>
         <w:rPr>
-          <w:rFonts w:ascii="Courier New" w:hAnsi="Courier New"/>
-          <w:sz w:val="16"/>
+          <w:b/>
         </w:rPr>
-        <w:t>import React, { useState } from 'react';</w:t>
-        <w:br/>
-        <w:t>import { Button, StyleSheet, Text, View } from 'react-native';</w:t>
-        <w:br/>
-        <w:br/>
-        <w:t>import FlatListScreen from './FlatlistScreen';</w:t>
-        <w:br/>
-        <w:t>import SectionListScreen from './SectionListScreen';</w:t>
-        <w:br/>
-        <w:br/>
-        <w:t>export default function MenuScreen() {</w:t>
-        <w:br/>
-        <w:t xml:space="preserve">  const [screen, setScreen] = useState(() =&gt; {</w:t>
-        <w:br/>
-        <w:t xml:space="preserve">    const hash = globalThis.location?.hash?.replace('#', '');</w:t>
-        <w:br/>
-        <w:t xml:space="preserve">    return hash === 'flatlist' || hash === 'sectionlist' ? hash : 'menu';</w:t>
-        <w:br/>
-        <w:t xml:space="preserve">  });</w:t>
-        <w:br/>
-        <w:br/>
-        <w:t xml:space="preserve">  switch (screen) {</w:t>
-        <w:br/>
-        <w:t xml:space="preserve">    case 'flatlist':</w:t>
-        <w:br/>
-        <w:t xml:space="preserve">      return &lt;FlatListScreen onBack={() =&gt; setScreen('menu')} /&gt;;</w:t>
-        <w:br/>
-        <w:br/>
-        <w:t xml:space="preserve">    case 'sectionlist':</w:t>
-        <w:br/>
-        <w:t xml:space="preserve">      return &lt;SectionListScreen onBack={() =&gt; setScreen('menu')} /&gt;;</w:t>
-        <w:br/>
-        <w:br/>
-        <w:t xml:space="preserve">    case 'menu':</w:t>
-        <w:br/>
-        <w:t xml:space="preserve">    default:</w:t>
-        <w:br/>
-        <w:t xml:space="preserve">      return (</w:t>
-        <w:br/>
-        <w:t xml:space="preserve">        &lt;View style={styles.container}&gt;</w:t>
-        <w:br/>
-        <w:t xml:space="preserve">          &lt;Text style={styles.titulo}&gt;Practica No. 14&lt;/Text&gt;</w:t>
-        <w:br/>
-        <w:t xml:space="preserve">          &lt;Text style={styles.subtitulo}&gt;FlatList &amp; SectionList&lt;/Text&gt;</w:t>
-        <w:br/>
-        <w:br/>
-        <w:t xml:space="preserve">          &lt;View style={styles.boton}&gt;</w:t>
-        <w:br/>
-        <w:t xml:space="preserve">            &lt;Button</w:t>
-        <w:br/>
-        <w:t xml:space="preserve">              title="Ver FlatList"</w:t>
-        <w:br/>
-        <w:t xml:space="preserve">              onPress={() =&gt; setScreen('flatlist')}</w:t>
-        <w:br/>
-        <w:t xml:space="preserve">            /&gt;</w:t>
-        <w:br/>
-        <w:t xml:space="preserve">          &lt;/View&gt;</w:t>
-        <w:br/>
-        <w:br/>
-        <w:t xml:space="preserve">          &lt;View style={styles.boton}&gt;</w:t>
-        <w:br/>
-        <w:t xml:space="preserve">            &lt;Button</w:t>
-        <w:br/>
-        <w:t xml:space="preserve">              title="Ver SectionList"</w:t>
-        <w:br/>
-        <w:t xml:space="preserve">              onPress={() =&gt; setScreen('sectionlist')}</w:t>
-        <w:br/>
-        <w:t xml:space="preserve">              color="#6C3EC1"</w:t>
-        <w:br/>
-        <w:t xml:space="preserve">            /&gt;</w:t>
-        <w:br/>
-        <w:t xml:space="preserve">          &lt;/View&gt;</w:t>
-        <w:br/>
-        <w:t xml:space="preserve">        &lt;/View&gt;</w:t>
-        <w:br/>
-        <w:t xml:space="preserve">      );</w:t>
-        <w:br/>
-        <w:t xml:space="preserve">  }</w:t>
-        <w:br/>
-        <w:t>}</w:t>
-        <w:br/>
-        <w:br/>
-        <w:t>const styles = StyleSheet.create({</w:t>
-        <w:br/>
-        <w:t xml:space="preserve">  container: {</w:t>
-        <w:br/>
-        <w:t xml:space="preserve">    alignItems: 'center',</w:t>
-        <w:br/>
-        <w:t xml:space="preserve">    backgroundColor: '#FFFFFF',</w:t>
-        <w:br/>
-        <w:t xml:space="preserve">    flex: 1,</w:t>
-        <w:br/>
-        <w:t xml:space="preserve">    justifyContent: 'center',</w:t>
-        <w:br/>
-        <w:t xml:space="preserve">    padding: 25,</w:t>
-        <w:br/>
-        <w:t xml:space="preserve">  },</w:t>
-        <w:br/>
-        <w:t xml:space="preserve">  titulo: {</w:t>
-        <w:br/>
-        <w:t xml:space="preserve">    fontSize: 24,</w:t>
-        <w:br/>
-        <w:t xml:space="preserve">    fontWeight: 'bold',</w:t>
-        <w:br/>
-        <w:t xml:space="preserve">    textAlign: 'center',</w:t>
-        <w:br/>
-        <w:t xml:space="preserve">  },</w:t>
-        <w:br/>
-        <w:t xml:space="preserve">  subtitulo: {</w:t>
-        <w:br/>
-        <w:t xml:space="preserve">    color: '#555555',</w:t>
-        <w:br/>
-        <w:t xml:space="preserve">    fontSize: 18,</w:t>
-        <w:br/>
-        <w:t xml:space="preserve">    marginBottom: 30,</w:t>
-        <w:br/>
-        <w:t xml:space="preserve">    marginTop: 6,</w:t>
-        <w:br/>
-        <w:t xml:space="preserve">    textAlign: 'center',</w:t>
-        <w:br/>
-        <w:t xml:space="preserve">  },</w:t>
-        <w:br/>
-        <w:t xml:space="preserve">  boton: {</w:t>
-        <w:br/>
-        <w:t xml:space="preserve">    marginBottom: 15,</w:t>
-        <w:br/>
-        <w:t xml:space="preserve">    maxWidth: 340,</w:t>
-        <w:br/>
-        <w:t xml:space="preserve">    width: '100%',</w:t>
-        <w:br/>
-        <w:t xml:space="preserve">  },</w:t>
-        <w:br/>
-        <w:t>});</w:t>
-        <w:br/>
+        <w:t>Captura 4. FlatlistScreen.js con arreglo de estudiantes y uso de FlatList.</w:t>
       </w:r>
     </w:p>
     <w:p>
       <w:pPr>
-        <w:pStyle w:val="Heading1"/>
+        <w:jc w:val="center"/>
       </w:pPr>
       <w:r>
-        <w:t>Codigo del componente FlatList: Screens/FlatlistScreen.js</w:t>
+        <w:drawing>
+          <wp:inline xmlns:a="http://schemas.openxmlformats.org/drawingml/2006/main" xmlns:pic="http://schemas.openxmlformats.org/drawingml/2006/picture">
+            <wp:extent cx="5852160" cy="3784979"/>
+            <wp:docPr id="4" name="Picture 4"/>
+            <wp:cNvGraphicFramePr>
+              <a:graphicFrameLocks noChangeAspect="1"/>
+            </wp:cNvGraphicFramePr>
+            <a:graphic>
+              <a:graphicData uri="http://schemas.openxmlformats.org/drawingml/2006/picture">
+                <pic:pic>
+                  <pic:nvPicPr>
+                    <pic:cNvPr id="0" name="04_flatlist_vscode.png"/>
+                    <pic:cNvPicPr/>
+                  </pic:nvPicPr>
+                  <pic:blipFill>
+                    <a:blip r:embed="rId12"/>
+                    <a:stretch>
+                      <a:fillRect/>
+                    </a:stretch>
+                  </pic:blipFill>
+                  <pic:spPr>
+                    <a:xfrm>
+                      <a:off x="0" y="0"/>
+                      <a:ext cx="5852160" cy="3784979"/>
+                    </a:xfrm>
+                    <a:prstGeom prst="rect"/>
+                  </pic:spPr>
+                </pic:pic>
+              </a:graphicData>
+            </a:graphic>
+          </wp:inline>
+        </w:drawing>
+      </w:r>
+    </w:p>
+    <w:p>
+      <w:r>
+        <w:rPr>
+          <w:b/>
+        </w:rPr>
+        <w:t>Captura 5. FlatlistScreen.js renderizando elementos con el componente Estudiante.</w:t>
       </w:r>
     </w:p>
     <w:p>
       <w:pPr>
-        <w:shd w:fill="F2F2F2"/>
+        <w:jc w:val="center"/>
       </w:pPr>
       <w:r>
+        <w:drawing>
+          <wp:inline xmlns:a="http://schemas.openxmlformats.org/drawingml/2006/main" xmlns:pic="http://schemas.openxmlformats.org/drawingml/2006/picture">
+            <wp:extent cx="5852160" cy="3784979"/>
+            <wp:docPr id="5" name="Picture 5"/>
+            <wp:cNvGraphicFramePr>
+              <a:graphicFrameLocks noChangeAspect="1"/>
+            </wp:cNvGraphicFramePr>
+            <a:graphic>
+              <a:graphicData uri="http://schemas.openxmlformats.org/drawingml/2006/picture">
+                <pic:pic>
+                  <pic:nvPicPr>
+                    <pic:cNvPr id="0" name="05_flatlist_final_vscode.png"/>
+                    <pic:cNvPicPr/>
+                  </pic:nvPicPr>
+                  <pic:blipFill>
+                    <a:blip r:embed="rId13"/>
+                    <a:stretch>
+                      <a:fillRect/>
+                    </a:stretch>
+                  </pic:blipFill>
+                  <pic:spPr>
+                    <a:xfrm>
+                      <a:off x="0" y="0"/>
+                      <a:ext cx="5852160" cy="3784979"/>
+                    </a:xfrm>
+                    <a:prstGeom prst="rect"/>
+                  </pic:spPr>
+                </pic:pic>
+              </a:graphicData>
+            </a:graphic>
+          </wp:inline>
+        </w:drawing>
+      </w:r>
+    </w:p>
+    <w:p>
+      <w:r>
         <w:rPr>
-          <w:rFonts w:ascii="Courier New" w:hAnsi="Courier New"/>
-          <w:sz w:val="16"/>
+          <w:b/>
         </w:rPr>
-        <w:t>import React from 'react';</w:t>
-        <w:br/>
-        <w:t>import { View, Text, StyleSheet, FlatList, Button } from 'react-native';</w:t>
-        <w:br/>
-        <w:t>import { Estudiante } from '../components/Estudiantes';</w:t>
-        <w:br/>
-        <w:br/>
-        <w:t>export default function FlatListScreen({ onBack }) {</w:t>
-        <w:br/>
-        <w:t xml:space="preserve">    const estudiantes = [</w:t>
-        <w:br/>
-        <w:t xml:space="preserve">        {</w:t>
-        <w:br/>
-        <w:t xml:space="preserve">            id: '1',</w:t>
-        <w:br/>
-        <w:t xml:space="preserve">            nombre: 'Erick',</w:t>
-        <w:br/>
-        <w:t xml:space="preserve">            carrera: 'ISC',</w:t>
-        <w:br/>
-        <w:t xml:space="preserve">        },</w:t>
-        <w:br/>
-        <w:t xml:space="preserve">        {</w:t>
-        <w:br/>
-        <w:t xml:space="preserve">            id: '2',</w:t>
-        <w:br/>
-        <w:t xml:space="preserve">            nombre: 'Josu',</w:t>
-        <w:br/>
-        <w:t xml:space="preserve">            carrera: 'ISC',</w:t>
-        <w:br/>
-        <w:t xml:space="preserve">        },</w:t>
-        <w:br/>
-        <w:t xml:space="preserve">        {</w:t>
-        <w:br/>
-        <w:t xml:space="preserve">            id: '3',</w:t>
-        <w:br/>
-        <w:t xml:space="preserve">            nombre: 'Plebe',</w:t>
-        <w:br/>
-        <w:t xml:space="preserve">            carrera: 'ISC',</w:t>
-        <w:br/>
-        <w:t xml:space="preserve">        },</w:t>
-        <w:br/>
-        <w:t xml:space="preserve">    ];</w:t>
-        <w:br/>
-        <w:br/>
-        <w:t xml:space="preserve">    return (</w:t>
-        <w:br/>
-        <w:t xml:space="preserve">        &lt;View style={styles.container}&gt;</w:t>
-        <w:br/>
-        <w:t xml:space="preserve">            &lt;Button title="Regresar" onPress={onBack} /&gt;</w:t>
-        <w:br/>
-        <w:t xml:space="preserve">            &lt;Text style={styles.titulo}&gt;Lista de estudiantes&lt;/Text&gt;</w:t>
-        <w:br/>
-        <w:br/>
-        <w:t xml:space="preserve">            &lt;FlatList</w:t>
-        <w:br/>
-        <w:t xml:space="preserve">                data={estudiantes}</w:t>
-        <w:br/>
-        <w:t xml:space="preserve">                keyExtractor={(item) =&gt; item.id}</w:t>
-        <w:br/>
-        <w:t xml:space="preserve">                renderItem={({ item }) =&gt; (</w:t>
-        <w:br/>
-        <w:t xml:space="preserve">                    &lt;Estudiante</w:t>
-        <w:br/>
-        <w:t xml:space="preserve">                        nombre={item.nombre}</w:t>
-        <w:br/>
-        <w:t xml:space="preserve">                        carrera={item.carrera}</w:t>
-        <w:br/>
-        <w:t xml:space="preserve">                    /&gt;</w:t>
-        <w:br/>
-        <w:t xml:space="preserve">                )}</w:t>
-        <w:br/>
-        <w:t xml:space="preserve">            /&gt;</w:t>
-        <w:br/>
-        <w:t xml:space="preserve">        &lt;/View&gt;</w:t>
-        <w:br/>
-        <w:t xml:space="preserve">    );</w:t>
-        <w:br/>
-        <w:t>}</w:t>
-        <w:br/>
-        <w:br/>
-        <w:t>const styles = StyleSheet.create({</w:t>
-        <w:br/>
-        <w:t xml:space="preserve">    container: {</w:t>
-        <w:br/>
-        <w:t xml:space="preserve">        flex: 1,</w:t>
-        <w:br/>
-        <w:t xml:space="preserve">        padding: 20,</w:t>
-        <w:br/>
-        <w:t xml:space="preserve">    },</w:t>
-        <w:br/>
-        <w:t xml:space="preserve">    titulo: {</w:t>
-        <w:br/>
-        <w:t xml:space="preserve">        fontSize: 25,</w:t>
-        <w:br/>
-        <w:t xml:space="preserve">        fontWeight: 'bold',</w:t>
-        <w:br/>
-        <w:t xml:space="preserve">        marginTop: 20,</w:t>
-        <w:br/>
-        <w:t xml:space="preserve">        marginBottom: 10,</w:t>
-        <w:br/>
-        <w:t xml:space="preserve">    },</w:t>
-        <w:br/>
-        <w:t>});</w:t>
-        <w:br/>
+        <w:t>Captura 6. SectionListScreen.js con datos agrupados por carrera.</w:t>
       </w:r>
     </w:p>
     <w:p>
       <w:pPr>
-        <w:pStyle w:val="Heading1"/>
+        <w:jc w:val="center"/>
       </w:pPr>
       <w:r>
-        <w:t>Codigo del componente SectionList: Screens/SectionListScreen.js</w:t>
+        <w:drawing>
+          <wp:inline xmlns:a="http://schemas.openxmlformats.org/drawingml/2006/main" xmlns:pic="http://schemas.openxmlformats.org/drawingml/2006/picture">
+            <wp:extent cx="5852160" cy="3784979"/>
+            <wp:docPr id="6" name="Picture 6"/>
+            <wp:cNvGraphicFramePr>
+              <a:graphicFrameLocks noChangeAspect="1"/>
+            </wp:cNvGraphicFramePr>
+            <a:graphic>
+              <a:graphicData uri="http://schemas.openxmlformats.org/drawingml/2006/picture">
+                <pic:pic>
+                  <pic:nvPicPr>
+                    <pic:cNvPr id="0" name="06_sectionlist_inicio_vscode.png"/>
+                    <pic:cNvPicPr/>
+                  </pic:nvPicPr>
+                  <pic:blipFill>
+                    <a:blip r:embed="rId14"/>
+                    <a:stretch>
+                      <a:fillRect/>
+                    </a:stretch>
+                  </pic:blipFill>
+                  <pic:spPr>
+                    <a:xfrm>
+                      <a:off x="0" y="0"/>
+                      <a:ext cx="5852160" cy="3784979"/>
+                    </a:xfrm>
+                    <a:prstGeom prst="rect"/>
+                  </pic:spPr>
+                </pic:pic>
+              </a:graphicData>
+            </a:graphic>
+          </wp:inline>
+        </w:drawing>
+      </w:r>
+    </w:p>
+    <w:p>
+      <w:r>
+        <w:rPr>
+          <w:b/>
+        </w:rPr>
+        <w:t>Captura 7. SectionListScreen.js renderizando secciones, encabezados y tarjetas.</w:t>
       </w:r>
     </w:p>
     <w:p>
       <w:pPr>
-        <w:shd w:fill="F2F2F2"/>
+        <w:jc w:val="center"/>
       </w:pPr>
       <w:r>
-        <w:rPr>
-          <w:rFonts w:ascii="Courier New" w:hAnsi="Courier New"/>
-          <w:sz w:val="16"/>
-        </w:rPr>
-        <w:t>import React from 'react';</w:t>
-        <w:br/>
-        <w:t>import { View, Text, SectionList, StyleSheet, Button } from 'react-native';</w:t>
-        <w:br/>
-        <w:br/>
-        <w:t>export default function SectionListScreen({ onBack }) {</w:t>
-        <w:br/>
-        <w:t xml:space="preserve">    const datos = [</w:t>
-        <w:br/>
-        <w:t xml:space="preserve">        {</w:t>
-        <w:br/>
-        <w:t xml:space="preserve">            title: 'Ingenieria en Sistemas',</w:t>
-        <w:br/>
-        <w:t xml:space="preserve">            data: [</w:t>
-        <w:br/>
-        <w:t xml:space="preserve">                { nombre: 'Juan' },</w:t>
-        <w:br/>
-        <w:t xml:space="preserve">                { nombre: 'Pedro' },</w:t>
-        <w:br/>
-        <w:t xml:space="preserve">            ],</w:t>
-        <w:br/>
-        <w:t xml:space="preserve">        },</w:t>
-        <w:br/>
-        <w:t xml:space="preserve">        {</w:t>
-        <w:br/>
-        <w:t xml:space="preserve">            title: 'Ingenieria Industrial',</w:t>
-        <w:br/>
-        <w:t xml:space="preserve">            data: [</w:t>
-        <w:br/>
-        <w:t xml:space="preserve">                { nombre: 'Alejandro' },</w:t>
-        <w:br/>
-        <w:t xml:space="preserve">                { nombre: 'Roberto' },</w:t>
-        <w:br/>
-        <w:t xml:space="preserve">            ],</w:t>
-        <w:br/>
-        <w:t xml:space="preserve">        },</w:t>
-        <w:br/>
-        <w:t xml:space="preserve">    ];</w:t>
-        <w:br/>
-        <w:br/>
-        <w:t xml:space="preserve">    return (</w:t>
-        <w:br/>
-        <w:t xml:space="preserve">        &lt;View style={styles.container}&gt;</w:t>
-        <w:br/>
-        <w:t xml:space="preserve">            &lt;Button title="Regresar" onPress={onBack} /&gt;</w:t>
-        <w:br/>
-        <w:t xml:space="preserve">            &lt;Text style={styles.titulo}&gt;Estudiantes de la carrera&lt;/Text&gt;</w:t>
-        <w:br/>
-        <w:br/>
-        <w:t xml:space="preserve">            &lt;SectionList</w:t>
-        <w:br/>
-        <w:t xml:space="preserve">                sections={datos}</w:t>
-        <w:br/>
-        <w:t xml:space="preserve">                keyExtractor={(item, index) =&gt; item.nombre + index}</w:t>
-        <w:br/>
-        <w:t xml:space="preserve">                renderSectionHeader={({ section }) =&gt; (</w:t>
-        <w:br/>
-        <w:t xml:space="preserve">                    &lt;Text style={styles.header}&gt;{section.title}&lt;/Text&gt;</w:t>
-        <w:br/>
-        <w:t xml:space="preserve">                )}</w:t>
-        <w:br/>
-        <w:t xml:space="preserve">                renderItem={({ item }) =&gt; (</w:t>
-        <w:br/>
-        <w:t xml:space="preserve">                    &lt;View style={styles.card}&gt;</w:t>
-        <w:br/>
-        <w:t xml:space="preserve">                        &lt;Text style={styles.item}&gt;{item.nombre}&lt;/Text&gt;</w:t>
-        <w:br/>
-        <w:t xml:space="preserve">                    &lt;/View&gt;</w:t>
-        <w:br/>
-        <w:t xml:space="preserve">                )}</w:t>
-        <w:br/>
-        <w:t xml:space="preserve">            /&gt;</w:t>
-        <w:br/>
-        <w:t xml:space="preserve">        &lt;/View&gt;</w:t>
-        <w:br/>
-        <w:t xml:space="preserve">    );</w:t>
-        <w:br/>
-        <w:t>}</w:t>
-        <w:br/>
-        <w:br/>
-        <w:t>const styles = StyleSheet.create({</w:t>
-        <w:br/>
-        <w:t xml:space="preserve">    container: {</w:t>
-        <w:br/>
-        <w:t xml:space="preserve">        flex: 1,</w:t>
-        <w:br/>
-        <w:t xml:space="preserve">        padding: 20,</w:t>
-        <w:br/>
-        <w:t xml:space="preserve">    },</w:t>
-        <w:br/>
-        <w:t xml:space="preserve">    titulo: {</w:t>
-        <w:br/>
-        <w:t xml:space="preserve">        fontSize: 25,</w:t>
-        <w:br/>
-        <w:t xml:space="preserve">        fontWeight: 'bold',</w:t>
-        <w:br/>
-        <w:t xml:space="preserve">        marginTop: 20,</w:t>
-        <w:br/>
-        <w:t xml:space="preserve">        marginBottom: 10,</w:t>
-        <w:br/>
-        <w:t xml:space="preserve">    },</w:t>
-        <w:br/>
-        <w:t xml:space="preserve">    header: {</w:t>
-        <w:br/>
-        <w:t xml:space="preserve">        fontSize: 20,</w:t>
-        <w:br/>
-        <w:t xml:space="preserve">        fontWeight: 'bold',</w:t>
-        <w:br/>
-        <w:t xml:space="preserve">        backgroundColor: '#fff',</w:t>
-        <w:br/>
-        <w:t xml:space="preserve">        paddingVertical: 8,</w:t>
-        <w:br/>
-        <w:t xml:space="preserve">    },</w:t>
-        <w:br/>
-        <w:t xml:space="preserve">    card: {</w:t>
-        <w:br/>
-        <w:t xml:space="preserve">        backgroundColor: '#d4f1f4',</w:t>
-        <w:br/>
-        <w:t xml:space="preserve">        padding: 15,</w:t>
-        <w:br/>
-        <w:t xml:space="preserve">        margin: 10,</w:t>
-        <w:br/>
-        <w:t xml:space="preserve">        borderRadius: 10,</w:t>
-        <w:br/>
-        <w:t xml:space="preserve">    },</w:t>
-        <w:br/>
-        <w:t xml:space="preserve">    item: {</w:t>
-        <w:br/>
-        <w:t xml:space="preserve">        fontSize: 16,</w:t>
-        <w:br/>
-        <w:t xml:space="preserve">    },</w:t>
-        <w:br/>
-        <w:t>});</w:t>
-        <w:br/>
+        <w:drawing>
+          <wp:inline xmlns:a="http://schemas.openxmlformats.org/drawingml/2006/main" xmlns:pic="http://schemas.openxmlformats.org/drawingml/2006/picture">
+            <wp:extent cx="5852160" cy="3784979"/>
+            <wp:docPr id="7" name="Picture 7"/>
+            <wp:cNvGraphicFramePr>
+              <a:graphicFrameLocks noChangeAspect="1"/>
+            </wp:cNvGraphicFramePr>
+            <a:graphic>
+              <a:graphicData uri="http://schemas.openxmlformats.org/drawingml/2006/picture">
+                <pic:pic>
+                  <pic:nvPicPr>
+                    <pic:cNvPr id="0" name="07_sectionlist_final_vscode.png"/>
+                    <pic:cNvPicPr/>
+                  </pic:nvPicPr>
+                  <pic:blipFill>
+                    <a:blip r:embed="rId15"/>
+                    <a:stretch>
+                      <a:fillRect/>
+                    </a:stretch>
+                  </pic:blipFill>
+                  <pic:spPr>
+                    <a:xfrm>
+                      <a:off x="0" y="0"/>
+                      <a:ext cx="5852160" cy="3784979"/>
+                    </a:xfrm>
+                    <a:prstGeom prst="rect"/>
+                  </pic:spPr>
+                </pic:pic>
+              </a:graphicData>
+            </a:graphic>
+          </wp:inline>
+        </w:drawing>
+      </w:r>
+    </w:p>
+    <w:p>
+      <w:r>
+        <w:br w:type="page"/>
       </w:r>
     </w:p>
     <w:p>
@@ -725,18 +543,15 @@
     </w:p>
     <w:p>
       <w:r>
-        <w:t>La aplicacion se ejecuto localmente con Expo y se abrio en un navegador con dimensiones de telefono. Las capturas muestran el menu principal y el funcionamiento de los dos componentes solicitados.</w:t>
+        <w:t>La aplicacion se ejecuto en Expo web para validar el menu principal y las pantallas de FlatList y SectionList. En telefono con Expo Go se mantiene el mismo flujo de navegacion y visualizacion.</w:t>
       </w:r>
     </w:p>
     <w:p>
-      <w:pPr>
-        <w:jc w:val="center"/>
-      </w:pPr>
       <w:r>
         <w:rPr>
           <w:b/>
         </w:rPr>
-        <w:t>Menu principal de la Practica 14.</w:t>
+        <w:t>Captura 8. Menu principal de la Practica 14.</w:t>
       </w:r>
     </w:p>
     <w:p>
@@ -746,8 +561,8 @@
       <w:r>
         <w:drawing>
           <wp:inline xmlns:a="http://schemas.openxmlformats.org/drawingml/2006/main" xmlns:pic="http://schemas.openxmlformats.org/drawingml/2006/picture">
-            <wp:extent cx="2468880" cy="5342910"/>
-            <wp:docPr id="1" name="Picture 1"/>
+            <wp:extent cx="2560320" cy="5540795"/>
+            <wp:docPr id="8" name="Picture 8"/>
             <wp:cNvGraphicFramePr>
               <a:graphicFrameLocks noChangeAspect="1"/>
             </wp:cNvGraphicFramePr>
@@ -759,7 +574,7 @@
                     <pic:cNvPicPr/>
                   </pic:nvPicPr>
                   <pic:blipFill>
-                    <a:blip r:embed="rId9"/>
+                    <a:blip r:embed="rId16"/>
                     <a:stretch>
                       <a:fillRect/>
                     </a:stretch>
@@ -767,7 +582,7 @@
                   <pic:spPr>
                     <a:xfrm>
                       <a:off x="0" y="0"/>
-                      <a:ext cx="2468880" cy="5342910"/>
+                      <a:ext cx="2560320" cy="5540795"/>
                     </a:xfrm>
                     <a:prstGeom prst="rect"/>
                   </pic:spPr>
@@ -779,14 +594,16 @@
       </w:r>
     </w:p>
     <w:p>
-      <w:pPr>
-        <w:jc w:val="center"/>
-      </w:pPr>
+      <w:r>
+        <w:br w:type="page"/>
+      </w:r>
+    </w:p>
+    <w:p>
       <w:r>
         <w:rPr>
           <w:b/>
         </w:rPr>
-        <w:t>Ejecucion del componente FlatList.</w:t>
+        <w:t>Captura 9. Ejecucion del componente FlatList.</w:t>
       </w:r>
     </w:p>
     <w:p>
@@ -796,8 +613,8 @@
       <w:r>
         <w:drawing>
           <wp:inline xmlns:a="http://schemas.openxmlformats.org/drawingml/2006/main" xmlns:pic="http://schemas.openxmlformats.org/drawingml/2006/picture">
-            <wp:extent cx="2468880" cy="5342910"/>
-            <wp:docPr id="2" name="Picture 2"/>
+            <wp:extent cx="2560320" cy="5540795"/>
+            <wp:docPr id="9" name="Picture 9"/>
             <wp:cNvGraphicFramePr>
               <a:graphicFrameLocks noChangeAspect="1"/>
             </wp:cNvGraphicFramePr>
@@ -809,7 +626,7 @@
                     <pic:cNvPicPr/>
                   </pic:nvPicPr>
                   <pic:blipFill>
-                    <a:blip r:embed="rId10"/>
+                    <a:blip r:embed="rId17"/>
                     <a:stretch>
                       <a:fillRect/>
                     </a:stretch>
@@ -817,7 +634,7 @@
                   <pic:spPr>
                     <a:xfrm>
                       <a:off x="0" y="0"/>
-                      <a:ext cx="2468880" cy="5342910"/>
+                      <a:ext cx="2560320" cy="5540795"/>
                     </a:xfrm>
                     <a:prstGeom prst="rect"/>
                   </pic:spPr>
@@ -829,14 +646,16 @@
       </w:r>
     </w:p>
     <w:p>
-      <w:pPr>
-        <w:jc w:val="center"/>
-      </w:pPr>
+      <w:r>
+        <w:br w:type="page"/>
+      </w:r>
+    </w:p>
+    <w:p>
       <w:r>
         <w:rPr>
           <w:b/>
         </w:rPr>
-        <w:t>Ejecucion del componente SectionList.</w:t>
+        <w:t>Captura 10. Ejecucion del componente SectionList.</w:t>
       </w:r>
     </w:p>
     <w:p>
@@ -846,8 +665,8 @@
       <w:r>
         <w:drawing>
           <wp:inline xmlns:a="http://schemas.openxmlformats.org/drawingml/2006/main" xmlns:pic="http://schemas.openxmlformats.org/drawingml/2006/picture">
-            <wp:extent cx="2468880" cy="5342910"/>
-            <wp:docPr id="3" name="Picture 3"/>
+            <wp:extent cx="2560320" cy="5540795"/>
+            <wp:docPr id="10" name="Picture 10"/>
             <wp:cNvGraphicFramePr>
               <a:graphicFrameLocks noChangeAspect="1"/>
             </wp:cNvGraphicFramePr>
@@ -859,7 +678,7 @@
                     <pic:cNvPicPr/>
                   </pic:nvPicPr>
                   <pic:blipFill>
-                    <a:blip r:embed="rId11"/>
+                    <a:blip r:embed="rId18"/>
                     <a:stretch>
                       <a:fillRect/>
                     </a:stretch>
@@ -867,7 +686,7 @@
                   <pic:spPr>
                     <a:xfrm>
                       <a:off x="0" y="0"/>
-                      <a:ext cx="2468880" cy="5342910"/>
+                      <a:ext cx="2560320" cy="5540795"/>
                     </a:xfrm>
                     <a:prstGeom prst="rect"/>
                   </pic:spPr>
@@ -883,23 +702,12 @@
         <w:pStyle w:val="Heading1"/>
       </w:pPr>
       <w:r>
-        <w:t>Comandos utilizados</w:t>
+        <w:t>Repositorio</w:t>
       </w:r>
     </w:p>
     <w:p>
-      <w:pPr>
-        <w:shd w:fill="F2F2F2"/>
-      </w:pPr>
       <w:r>
-        <w:rPr>
-          <w:rFonts w:ascii="Courier New" w:hAnsi="Courier New"/>
-          <w:sz w:val="16"/>
-        </w:rPr>
-        <w:t>cd "C:\PROGRAMACION\APLICACIONES MOVILES\practica14\Practica5"</w:t>
-        <w:br/>
-        <w:t>npx expo start --web --port 19014</w:t>
-        <w:br/>
-        <w:t>npx expo export --platform web --output-dir "C:\PROGRAMACION\APLICACIONES MOVILES\output\practica14_web_export"</w:t>
+        <w:t>https://github.com/Josved/CAFETERIA-INDV.git</w:t>
       </w:r>
     </w:p>
     <w:p>
@@ -912,7 +720,7 @@
     </w:p>
     <w:p>
       <w:r>
-        <w:t>La Practica No.14 se realizo correctamente. La aplicacion muestra un menu principal y permite visualizar una lista simple con FlatList y una lista agrupada con SectionList. La exportacion web de Expo finalizo sin errores y las capturas evidencian que los componentes funcionan de acuerdo con lo solicitado.</w:t>
+        <w:t>La practica se realizo correctamente. Se creo una aplicacion funcional con un menu principal que permite visualizar una lista simple con FlatList y una lista agrupada con SectionList. Las capturas de Visual Studio Code muestran las partes principales del codigo y las capturas de ejecucion comprueban que los componentes solicitados funcionan de acuerdo con la actividad.</w:t>
       </w:r>
     </w:p>
     <w:sectPr>
@@ -1356,7 +1164,7 @@
       <w:b/>
       <w:bCs/>
       <w:color w:val="365F91" w:themeColor="accent1" w:themeShade="BF"/>
-      <w:sz w:val="28"/>
+      <w:sz w:val="32"/>
       <w:szCs w:val="28"/>
     </w:rPr>
   </w:style>
@@ -1376,7 +1184,7 @@
       <w:outlineLvl w:val="1"/>
     </w:pPr>
     <w:rPr>
-      <w:rFonts w:asciiTheme="majorHAnsi" w:eastAsiaTheme="majorEastAsia" w:hAnsiTheme="majorHAnsi" w:cstheme="majorBidi" w:ascii="Arial" w:hAnsi="Arial"/>
+      <w:rFonts w:asciiTheme="majorHAnsi" w:eastAsiaTheme="majorEastAsia" w:hAnsiTheme="majorHAnsi" w:cstheme="majorBidi"/>
       <w:b/>
       <w:bCs/>
       <w:color w:val="4F81BD" w:themeColor="accent1"/>
@@ -1641,7 +1449,7 @@
       <w:contextualSpacing/>
     </w:pPr>
     <w:rPr>
-      <w:rFonts w:asciiTheme="majorHAnsi" w:eastAsiaTheme="majorEastAsia" w:hAnsiTheme="majorHAnsi" w:cstheme="majorBidi" w:ascii="Arial" w:hAnsi="Arial"/>
+      <w:rFonts w:asciiTheme="majorHAnsi" w:eastAsiaTheme="majorEastAsia" w:hAnsiTheme="majorHAnsi" w:cstheme="majorBidi"/>
       <w:color w:val="17365D" w:themeColor="text2" w:themeShade="BF"/>
       <w:spacing w:val="5"/>
       <w:kern w:val="28"/>

</xml_diff>